<commit_message>
Altes Deploy-Paket algoquest-webapp.tar entfernt
Die App wird direkt aus GitHub gebaut; Verweise in Gesamtübersicht, LIESMICH und CLAUDE.md angepasst.

Co-Authored-By: Claude Opus 5.5 <noreply@anthropic.com>
Claude-Session: https://claude.ai/code/session_01CemoEYGRdCe5FszEBVFFUP
</commit_message>
<xml_diff>
--- a/materialien/00_Lehrerhinweise/AQ_Gesamtuebersicht_DS1-40.docx
+++ b/materialien/00_Lehrerhinweise/AQ_Gesamtuebersicht_DS1-40.docx
@@ -34440,7 +34440,7 @@
                 <w:sz w:val="16"/>
                 <w:szCs w:val="16"/>
               </w:rPr>
-              <w:t xml:space="preserve">                                docs/*.png (Screenshots), algoquest-webapp.tar (CapRover)</w:t>
+              <w:t xml:space="preserve">                                docs/*.png (Screenshots), Deploy: CapRover baut direkt aus GitHub</w:t>
             </w:r>
           </w:p>
         </w:tc>
@@ -35097,7 +35097,7 @@
                 <w:sz w:val="14"/>
                 <w:szCs w:val="14"/>
               </w:rPr>
-              <w:t xml:space="preserve">Algo Quest Lab 2.0: README.md (Funktionen, Betrieb mit CapRover, Upgrade von v1.x, Datenschutz) · docs/AUFGABENFORMAT.md (Format der Lab-Aufgaben) · docs/*.png (Screenshots) · algoquest-webapp.tar (Deploy-Paket für CapRover) · Quellcode: src/, public/, seed/ (welten/, warmup/), scripts/, test/, Dockerfile, captain-definition, package.json</w:t>
+              <w:t xml:space="preserve">Algo Quest Lab 2.0: README.md (Funktionen, Betrieb mit CapRover, Upgrade von v1.x, Datenschutz) · docs/AUFGABENFORMAT.md (Format der Lab-Aufgaben) · docs/*.png (Screenshots) · Deploy: CapRover baut bei jedem Push auf main direkt aus GitHub · Quellcode: src/, public/, seed/ (welten/, warmup/), scripts/, test/, Dockerfile, captain-definition, package.json</w:t>
             </w:r>
           </w:p>
         </w:tc>

</xml_diff>

<commit_message>
Weiterspielen nur mit Name + persönlichem Code (ohne Kurscode)
- Anmeldung: kursübergreifende Suche nach Name + Code; Kurscode nur noch, wenn beides zu mehreren Kursen
  passt (nur bei alten, doppelt vergebenen Codes möglich) – Startseite blendet das Feld dann ein (409 kurscodeNoetig)
- Neue Codes werden kursübergreifend eindeutig vergeben (Beitritt und „neuer Code“); Index auf schueler.code
- Rate-Limit je Name statt je Kurscode + Name
- Texte in Lab, README und Materialien angepasst (Im-Lab-üben-Kästen, Kickoff-Folie inkl. Screenshot,
  Lehrerhinweise, Gesamtübersicht); PDFs neu erzeugt; Tests; Version 2.3.0

Co-Authored-By: Claude Opus 5.5 <noreply@anthropic.com>
Claude-Session: https://claude.ai/code/session_01CemoEYGRdCe5FszEBVFFUP
</commit_message>
<xml_diff>
--- a/materialien/00_Lehrerhinweise/AQ_Gesamtuebersicht_DS1-40.docx
+++ b/materialien/00_Lehrerhinweise/AQ_Gesamtuebersicht_DS1-40.docx
@@ -24341,7 +24341,7 @@
           <w:sz w:val="22"/>
           <w:szCs w:val="22"/>
         </w:rPr>
-        <w:t xml:space="preserve"> algoquest.frankjuchim.de öffnen bzw. QR-Code des Kurses scannen → Kurscode + Name (Vorname + Initial, z. B. „Lena S.“) → das Lab zeigt einen persönlichen Code (z. B. K7M-42Q) – </w:t>
+        <w:t xml:space="preserve"> algoquest.frankjuchim.de öffnen bzw. QR-Code des Kurses scannen → Kurscode + Name (Vorname + Initial, z. B. „Lena S.“) → das Lab zeigt einen persönlichen Code (z. B. KMQ-427) – </w:t>
       </w:r>
       <w:r>
         <w:rPr>
@@ -24359,7 +24359,7 @@
           <w:sz w:val="22"/>
           <w:szCs w:val="22"/>
         </w:rPr>
-        <w:t xml:space="preserve"> Weiterspielen auf jedem Gerät mit Kurscode + Name + Code.</w:t>
+        <w:t xml:space="preserve"> Weiterspielen auf jedem Gerät mit Name + Code.</w:t>
       </w:r>
     </w:p>
     <w:p>

</xml_diff>